<commit_message>
Fix reviewer feedback: Q5 text contradiction, Figure 5 empty panel, R→Python, TOC cleanup
- Fix Section 3.7 Q5 text to match Figure 6 heatmap (YouTube scores highest
  on currency due to auto-displayed dates, not websites)
- Redesign Figure 5 as 2x3 grid (Views + Likes) with Instagram "Insufficient
  data" label for view counts
- Update Section 2.7 and flow diagram from R to Python 3.13
- Update abstract with corrected statistics (H=93.84, η²≈.46, ICC=0.932)
- Add Simpson's paradox mention and tone down causal language throughout
- Remove TOC instruction block from assembled thesis
- Rename Section 2.4 to "Study Sample and Sampling Frame"

Co-Authored-By: Claude Opus 4.6 <noreply@anthropic.com>
</commit_message>
<xml_diff>
--- a/chapters/abstract.docx
+++ b/chapters/abstract.docx
@@ -69,7 +69,7 @@
           <w:i w:val="0"/>
           <w:sz w:val="24"/>
         </w:rPr>
-        <w:t>Background. The internet and social media platforms have become primary sources of physical activity (PA) information for the general public. However, the quality of this information varies across platforms, and no study has simultaneously compared traditional websites, YouTube, TikTok, and Instagram using standardised quality assessment instruments for PA content.</w:t>
+        <w:t>Background. The internet and social media platforms have become primary sources of physical activity (PA) information for the general public. However, the quality of this information varies considerably across platforms, and no study has simultaneously compared traditional websites, YouTube, TikTok, and Instagram using standardised quality assessment instruments.</w:t>
       </w:r>
     </w:p>
     <w:p>
@@ -114,7 +114,7 @@
           <w:i w:val="0"/>
           <w:sz w:val="24"/>
         </w:rPr>
-        <w:t>Results. A significant quality gradient was observed across platforms, H(3) = 93.84, p &lt; .001, with a large effect size (η² = .46). Traditional websites scored highest (Mdn = 48.5, Fair), followed by YouTube (Mdn = 42.0, Fair), TikTok (Mdn = 35.0, Poor), and Instagram (Mdn = 27.5, Poor–Very Poor). Five of six pairwise comparisons were significant at p &lt; .001; the Website–YouTube difference reached p = .038. JAMA compliance was universally low (M = 1.4/4 criteria met). When individual creator types were compared, a significant effect emerged (H = 11.26, p = .024), with healthcare professionals and certified fitness professionals scoring highest (Mdn = 41.0) and general users lowest (Mdn = 33.0). Views bore no relationship to information quality (ρ = −.073, p = .571). Inter-rater reliability was excellent (ICC = 0.932, 95% CI [.870, .960]).</w:t>
+        <w:t>Results. A significant quality gradient was observed across platforms, H(3) = 93.84, p &lt; .001, η² ≈ .46 (large effect). Traditional websites scored highest (Mdn = 48.5, Fair), followed by YouTube (Mdn = 42.0, Fair), TikTok (Mdn = 35.0, Poor), and Instagram (Mdn = 27.5, Poor–Very Poor). All six pairwise comparisons were statistically significant (p &lt; .05), though the website–YouTube contrast was more modest (p = .038). JAMA compliance was universally low (M = 1.4/4 criteria met). A five-category creator type analysis was significant (H[4] = 11.26, p = .024), though the binary professional versus non-professional comparison was not (p = .094). Within-platform engagement–quality correlations were generally non-significant, and the apparent overall positive correlation between likes and quality was identified as a Simpson’s paradox artefact. Inter-rater reliability was excellent (ICC = 0.932, 95% CI [0.870, 0.960]).</w:t>
       </w:r>
     </w:p>
     <w:p>
@@ -129,7 +129,7 @@
           <w:i w:val="0"/>
           <w:sz w:val="24"/>
         </w:rPr>
-        <w:t>Conclusions. Physical activity information quality varies substantially across digital platforms, with social media—particularly Instagram and TikTok—providing lower-quality content than traditional websites. The absence of any relationship between view counts and quality suggests that platform algorithms do not promote accurate health information. Multi-stakeholder interventions targeting platform design, creator education, and consumer health literacy are needed to improve the quality of PA information in the digital ecosystem.</w:t>
+        <w:t>Conclusions. Physical activity information quality differs substantially across digital platforms, with short-form social media—particularly Instagram and TikTok—providing lower-quality content than traditional websites. Engagement metrics do not appear to reliably indicate information quality within platforms, suggesting that popular content is not necessarily accurate content. These findings highlight the need for multi-stakeholder interventions targeting platform design, creator education, and consumer health literacy to improve the quality of PA information in the digital ecosystem.</w:t>
       </w:r>
     </w:p>
     <w:p>

</xml_diff>